<commit_message>
Updated project with new files and modifications
</commit_message>
<xml_diff>
--- a/Documents/Wifi Bastion Paper.docx
+++ b/Documents/Wifi Bastion Paper.docx
@@ -1994,15 +1994,7 @@
           <w:b/>
           <w:bCs/>
         </w:rPr>
-        <w:t>Existing</w:t>
-      </w:r>
-      <w:r>
-        <w:rPr>
-          <w:rFonts w:ascii="Times New Roman" w:eastAsia="Times New Roman" w:hAnsi="Times New Roman" w:cs="Times New Roman"/>
-          <w:b/>
-          <w:bCs/>
-        </w:rPr>
-        <w:t xml:space="preserve"> System:</w:t>
+        <w:t>Existing System:</w:t>
       </w:r>
       <w:r>
         <w:rPr>
@@ -4013,6 +4005,344 @@
     </w:p>
     <w:p>
       <w:pPr>
+        <w:spacing w:before="100" w:beforeAutospacing="1" w:after="100" w:afterAutospacing="1" w:line="240" w:lineRule="auto"/>
+        <w:rPr>
+          <w:rFonts w:ascii="Times New Roman" w:eastAsia="Times New Roman" w:hAnsi="Times New Roman" w:cs="Times New Roman"/>
+          <w:color w:val="auto"/>
+          <w:kern w:val="0"/>
+          <w:sz w:val="24"/>
+          <w:szCs w:val="24"/>
+          <w14:ligatures w14:val="none"/>
+        </w:rPr>
+      </w:pPr>
+    </w:p>
+    <w:p>
+      <w:pPr>
+        <w:spacing w:before="100" w:beforeAutospacing="1" w:after="100" w:afterAutospacing="1" w:line="240" w:lineRule="auto"/>
+        <w:rPr>
+          <w:rFonts w:ascii="Times New Roman" w:eastAsia="Times New Roman" w:hAnsi="Times New Roman" w:cs="Times New Roman"/>
+          <w:color w:val="auto"/>
+          <w:kern w:val="0"/>
+          <w:sz w:val="24"/>
+          <w:szCs w:val="24"/>
+          <w14:ligatures w14:val="none"/>
+        </w:rPr>
+      </w:pPr>
+    </w:p>
+    <w:p>
+      <w:pPr>
+        <w:spacing w:before="100" w:beforeAutospacing="1" w:after="100" w:afterAutospacing="1" w:line="240" w:lineRule="auto"/>
+        <w:rPr>
+          <w:rFonts w:ascii="Times New Roman" w:eastAsia="Times New Roman" w:hAnsi="Times New Roman" w:cs="Times New Roman"/>
+          <w:color w:val="auto"/>
+          <w:kern w:val="0"/>
+          <w:sz w:val="24"/>
+          <w:szCs w:val="24"/>
+          <w14:ligatures w14:val="none"/>
+        </w:rPr>
+      </w:pPr>
+    </w:p>
+    <w:p>
+      <w:pPr>
+        <w:spacing w:before="100" w:beforeAutospacing="1" w:after="100" w:afterAutospacing="1" w:line="240" w:lineRule="auto"/>
+        <w:rPr>
+          <w:rFonts w:ascii="Times New Roman" w:eastAsia="Times New Roman" w:hAnsi="Times New Roman" w:cs="Times New Roman"/>
+          <w:color w:val="auto"/>
+          <w:kern w:val="0"/>
+          <w:sz w:val="24"/>
+          <w:szCs w:val="24"/>
+          <w14:ligatures w14:val="none"/>
+        </w:rPr>
+      </w:pPr>
+    </w:p>
+    <w:p>
+      <w:pPr>
+        <w:spacing w:before="100" w:beforeAutospacing="1" w:after="100" w:afterAutospacing="1" w:line="240" w:lineRule="auto"/>
+        <w:rPr>
+          <w:rFonts w:ascii="Times New Roman" w:eastAsia="Times New Roman" w:hAnsi="Times New Roman" w:cs="Times New Roman"/>
+          <w:color w:val="auto"/>
+          <w:kern w:val="0"/>
+          <w:sz w:val="24"/>
+          <w:szCs w:val="24"/>
+          <w14:ligatures w14:val="none"/>
+        </w:rPr>
+      </w:pPr>
+    </w:p>
+    <w:p>
+      <w:pPr>
+        <w:spacing w:before="100" w:beforeAutospacing="1" w:after="100" w:afterAutospacing="1" w:line="240" w:lineRule="auto"/>
+        <w:rPr>
+          <w:rFonts w:ascii="Times New Roman" w:eastAsia="Times New Roman" w:hAnsi="Times New Roman" w:cs="Times New Roman"/>
+          <w:color w:val="auto"/>
+          <w:kern w:val="0"/>
+          <w:sz w:val="24"/>
+          <w:szCs w:val="24"/>
+          <w14:ligatures w14:val="none"/>
+        </w:rPr>
+      </w:pPr>
+    </w:p>
+    <w:p>
+      <w:pPr>
+        <w:spacing w:before="100" w:beforeAutospacing="1" w:after="100" w:afterAutospacing="1" w:line="240" w:lineRule="auto"/>
+        <w:rPr>
+          <w:rFonts w:ascii="Times New Roman" w:eastAsia="Times New Roman" w:hAnsi="Times New Roman" w:cs="Times New Roman"/>
+          <w:color w:val="auto"/>
+          <w:kern w:val="0"/>
+          <w:sz w:val="24"/>
+          <w:szCs w:val="24"/>
+          <w14:ligatures w14:val="none"/>
+        </w:rPr>
+      </w:pPr>
+    </w:p>
+    <w:p>
+      <w:pPr>
+        <w:spacing w:before="100" w:beforeAutospacing="1" w:after="100" w:afterAutospacing="1" w:line="240" w:lineRule="auto"/>
+        <w:rPr>
+          <w:rFonts w:ascii="Times New Roman" w:eastAsia="Times New Roman" w:hAnsi="Times New Roman" w:cs="Times New Roman"/>
+          <w:color w:val="auto"/>
+          <w:kern w:val="0"/>
+          <w:sz w:val="24"/>
+          <w:szCs w:val="24"/>
+          <w14:ligatures w14:val="none"/>
+        </w:rPr>
+      </w:pPr>
+    </w:p>
+    <w:p>
+      <w:pPr>
+        <w:spacing w:before="100" w:beforeAutospacing="1" w:after="100" w:afterAutospacing="1" w:line="240" w:lineRule="auto"/>
+        <w:rPr>
+          <w:rFonts w:ascii="Times New Roman" w:eastAsia="Times New Roman" w:hAnsi="Times New Roman" w:cs="Times New Roman"/>
+          <w:color w:val="auto"/>
+          <w:kern w:val="0"/>
+          <w:sz w:val="24"/>
+          <w:szCs w:val="24"/>
+          <w14:ligatures w14:val="none"/>
+        </w:rPr>
+      </w:pPr>
+    </w:p>
+    <w:p>
+      <w:pPr>
+        <w:spacing w:before="100" w:beforeAutospacing="1" w:after="100" w:afterAutospacing="1" w:line="240" w:lineRule="auto"/>
+        <w:rPr>
+          <w:rFonts w:ascii="Times New Roman" w:eastAsia="Times New Roman" w:hAnsi="Times New Roman" w:cs="Times New Roman"/>
+          <w:color w:val="auto"/>
+          <w:kern w:val="0"/>
+          <w:sz w:val="24"/>
+          <w:szCs w:val="24"/>
+          <w14:ligatures w14:val="none"/>
+        </w:rPr>
+      </w:pPr>
+    </w:p>
+    <w:p>
+      <w:pPr>
+        <w:spacing w:before="100" w:beforeAutospacing="1" w:after="100" w:afterAutospacing="1" w:line="240" w:lineRule="auto"/>
+        <w:rPr>
+          <w:rFonts w:ascii="Times New Roman" w:eastAsia="Times New Roman" w:hAnsi="Times New Roman" w:cs="Times New Roman"/>
+          <w:color w:val="auto"/>
+          <w:kern w:val="0"/>
+          <w:sz w:val="24"/>
+          <w:szCs w:val="24"/>
+          <w14:ligatures w14:val="none"/>
+        </w:rPr>
+      </w:pPr>
+    </w:p>
+    <w:p>
+      <w:pPr>
+        <w:spacing w:before="100" w:beforeAutospacing="1" w:after="100" w:afterAutospacing="1" w:line="240" w:lineRule="auto"/>
+        <w:rPr>
+          <w:rFonts w:ascii="Times New Roman" w:eastAsia="Times New Roman" w:hAnsi="Times New Roman" w:cs="Times New Roman"/>
+          <w:color w:val="auto"/>
+          <w:kern w:val="0"/>
+          <w:sz w:val="24"/>
+          <w:szCs w:val="24"/>
+          <w14:ligatures w14:val="none"/>
+        </w:rPr>
+      </w:pPr>
+    </w:p>
+    <w:p>
+      <w:pPr>
+        <w:spacing w:before="100" w:beforeAutospacing="1" w:after="100" w:afterAutospacing="1" w:line="240" w:lineRule="auto"/>
+        <w:rPr>
+          <w:rFonts w:ascii="Times New Roman" w:eastAsia="Times New Roman" w:hAnsi="Times New Roman" w:cs="Times New Roman"/>
+          <w:color w:val="auto"/>
+          <w:kern w:val="0"/>
+          <w:sz w:val="24"/>
+          <w:szCs w:val="24"/>
+          <w14:ligatures w14:val="none"/>
+        </w:rPr>
+      </w:pPr>
+    </w:p>
+    <w:p>
+      <w:pPr>
+        <w:spacing w:before="100" w:beforeAutospacing="1" w:after="100" w:afterAutospacing="1" w:line="240" w:lineRule="auto"/>
+        <w:rPr>
+          <w:rFonts w:ascii="Times New Roman" w:eastAsia="Times New Roman" w:hAnsi="Times New Roman" w:cs="Times New Roman"/>
+          <w:color w:val="auto"/>
+          <w:kern w:val="0"/>
+          <w:sz w:val="24"/>
+          <w:szCs w:val="24"/>
+          <w14:ligatures w14:val="none"/>
+        </w:rPr>
+      </w:pPr>
+    </w:p>
+    <w:p>
+      <w:pPr>
+        <w:spacing w:before="100" w:beforeAutospacing="1" w:after="100" w:afterAutospacing="1" w:line="240" w:lineRule="auto"/>
+        <w:rPr>
+          <w:rFonts w:ascii="Times New Roman" w:eastAsia="Times New Roman" w:hAnsi="Times New Roman" w:cs="Times New Roman"/>
+          <w:color w:val="auto"/>
+          <w:kern w:val="0"/>
+          <w:sz w:val="24"/>
+          <w:szCs w:val="24"/>
+          <w14:ligatures w14:val="none"/>
+        </w:rPr>
+      </w:pPr>
+    </w:p>
+    <w:p>
+      <w:pPr>
+        <w:spacing w:before="100" w:beforeAutospacing="1" w:after="100" w:afterAutospacing="1" w:line="240" w:lineRule="auto"/>
+        <w:rPr>
+          <w:rFonts w:ascii="Times New Roman" w:eastAsia="Times New Roman" w:hAnsi="Times New Roman" w:cs="Times New Roman"/>
+          <w:color w:val="auto"/>
+          <w:kern w:val="0"/>
+          <w:sz w:val="24"/>
+          <w:szCs w:val="24"/>
+          <w14:ligatures w14:val="none"/>
+        </w:rPr>
+      </w:pPr>
+    </w:p>
+    <w:p>
+      <w:pPr>
+        <w:spacing w:before="100" w:beforeAutospacing="1" w:after="100" w:afterAutospacing="1" w:line="240" w:lineRule="auto"/>
+        <w:rPr>
+          <w:rFonts w:ascii="Times New Roman" w:eastAsia="Times New Roman" w:hAnsi="Times New Roman" w:cs="Times New Roman"/>
+          <w:color w:val="auto"/>
+          <w:kern w:val="0"/>
+          <w:sz w:val="24"/>
+          <w:szCs w:val="24"/>
+          <w14:ligatures w14:val="none"/>
+        </w:rPr>
+      </w:pPr>
+    </w:p>
+    <w:p>
+      <w:pPr>
+        <w:spacing w:before="100" w:beforeAutospacing="1" w:after="100" w:afterAutospacing="1" w:line="240" w:lineRule="auto"/>
+        <w:rPr>
+          <w:rFonts w:ascii="Times New Roman" w:eastAsia="Times New Roman" w:hAnsi="Times New Roman" w:cs="Times New Roman"/>
+          <w:color w:val="auto"/>
+          <w:kern w:val="0"/>
+          <w:sz w:val="24"/>
+          <w:szCs w:val="24"/>
+          <w14:ligatures w14:val="none"/>
+        </w:rPr>
+      </w:pPr>
+    </w:p>
+    <w:p>
+      <w:pPr>
+        <w:spacing w:before="100" w:beforeAutospacing="1" w:after="100" w:afterAutospacing="1" w:line="240" w:lineRule="auto"/>
+        <w:rPr>
+          <w:rFonts w:ascii="Times New Roman" w:eastAsia="Times New Roman" w:hAnsi="Times New Roman" w:cs="Times New Roman"/>
+          <w:color w:val="auto"/>
+          <w:kern w:val="0"/>
+          <w:sz w:val="24"/>
+          <w:szCs w:val="24"/>
+          <w14:ligatures w14:val="none"/>
+        </w:rPr>
+      </w:pPr>
+    </w:p>
+    <w:p>
+      <w:pPr>
+        <w:spacing w:before="100" w:beforeAutospacing="1" w:after="100" w:afterAutospacing="1" w:line="240" w:lineRule="auto"/>
+        <w:rPr>
+          <w:rFonts w:ascii="Times New Roman" w:eastAsia="Times New Roman" w:hAnsi="Times New Roman" w:cs="Times New Roman"/>
+          <w:color w:val="auto"/>
+          <w:kern w:val="0"/>
+          <w:sz w:val="24"/>
+          <w:szCs w:val="24"/>
+          <w14:ligatures w14:val="none"/>
+        </w:rPr>
+      </w:pPr>
+    </w:p>
+    <w:p>
+      <w:pPr>
+        <w:spacing w:before="100" w:beforeAutospacing="1" w:after="100" w:afterAutospacing="1" w:line="240" w:lineRule="auto"/>
+        <w:rPr>
+          <w:rFonts w:ascii="Times New Roman" w:eastAsia="Times New Roman" w:hAnsi="Times New Roman" w:cs="Times New Roman"/>
+          <w:color w:val="auto"/>
+          <w:kern w:val="0"/>
+          <w:sz w:val="24"/>
+          <w:szCs w:val="24"/>
+          <w14:ligatures w14:val="none"/>
+        </w:rPr>
+      </w:pPr>
+    </w:p>
+    <w:p>
+      <w:pPr>
+        <w:spacing w:before="100" w:beforeAutospacing="1" w:after="100" w:afterAutospacing="1" w:line="240" w:lineRule="auto"/>
+        <w:rPr>
+          <w:rFonts w:ascii="Times New Roman" w:eastAsia="Times New Roman" w:hAnsi="Times New Roman" w:cs="Times New Roman"/>
+          <w:color w:val="auto"/>
+          <w:kern w:val="0"/>
+          <w:sz w:val="24"/>
+          <w:szCs w:val="24"/>
+          <w14:ligatures w14:val="none"/>
+        </w:rPr>
+      </w:pPr>
+    </w:p>
+    <w:p>
+      <w:pPr>
+        <w:spacing w:before="100" w:beforeAutospacing="1" w:after="100" w:afterAutospacing="1" w:line="240" w:lineRule="auto"/>
+        <w:rPr>
+          <w:rFonts w:ascii="Times New Roman" w:eastAsia="Times New Roman" w:hAnsi="Times New Roman" w:cs="Times New Roman"/>
+          <w:color w:val="auto"/>
+          <w:kern w:val="0"/>
+          <w:sz w:val="24"/>
+          <w:szCs w:val="24"/>
+          <w14:ligatures w14:val="none"/>
+        </w:rPr>
+      </w:pPr>
+    </w:p>
+    <w:p>
+      <w:pPr>
+        <w:spacing w:before="100" w:beforeAutospacing="1" w:after="100" w:afterAutospacing="1" w:line="240" w:lineRule="auto"/>
+        <w:rPr>
+          <w:rFonts w:ascii="Times New Roman" w:eastAsia="Times New Roman" w:hAnsi="Times New Roman" w:cs="Times New Roman"/>
+          <w:color w:val="auto"/>
+          <w:kern w:val="0"/>
+          <w:sz w:val="24"/>
+          <w:szCs w:val="24"/>
+          <w14:ligatures w14:val="none"/>
+        </w:rPr>
+      </w:pPr>
+    </w:p>
+    <w:p>
+      <w:pPr>
+        <w:spacing w:before="100" w:beforeAutospacing="1" w:after="100" w:afterAutospacing="1" w:line="240" w:lineRule="auto"/>
+        <w:rPr>
+          <w:rFonts w:ascii="Times New Roman" w:eastAsia="Times New Roman" w:hAnsi="Times New Roman" w:cs="Times New Roman"/>
+          <w:color w:val="auto"/>
+          <w:kern w:val="0"/>
+          <w:sz w:val="24"/>
+          <w:szCs w:val="24"/>
+          <w14:ligatures w14:val="none"/>
+        </w:rPr>
+      </w:pPr>
+    </w:p>
+    <w:p>
+      <w:pPr>
+        <w:spacing w:before="100" w:beforeAutospacing="1" w:after="100" w:afterAutospacing="1" w:line="240" w:lineRule="auto"/>
+        <w:rPr>
+          <w:rFonts w:ascii="Times New Roman" w:eastAsia="Times New Roman" w:hAnsi="Times New Roman" w:cs="Times New Roman"/>
+          <w:color w:val="auto"/>
+          <w:kern w:val="0"/>
+          <w:sz w:val="24"/>
+          <w:szCs w:val="24"/>
+          <w14:ligatures w14:val="none"/>
+        </w:rPr>
+      </w:pPr>
+    </w:p>
+    <w:p>
+      <w:pPr>
         <w:pStyle w:val="ListParagraph"/>
         <w:numPr>
           <w:ilvl w:val="0"/>
@@ -4389,6 +4719,32 @@
         <w:br/>
         <w:t>Journal of Cybersecurity Research, 2024.</w:t>
       </w:r>
+    </w:p>
+    <w:p>
+      <w:pPr>
+        <w:spacing w:before="100" w:beforeAutospacing="1" w:after="100" w:afterAutospacing="1" w:line="240" w:lineRule="auto"/>
+        <w:rPr>
+          <w:rFonts w:ascii="Times New Roman" w:eastAsia="Times New Roman" w:hAnsi="Times New Roman" w:cs="Times New Roman"/>
+          <w:color w:val="auto"/>
+          <w:kern w:val="0"/>
+          <w:sz w:val="24"/>
+          <w:szCs w:val="24"/>
+          <w14:ligatures w14:val="none"/>
+        </w:rPr>
+      </w:pPr>
+    </w:p>
+    <w:p>
+      <w:pPr>
+        <w:spacing w:before="100" w:beforeAutospacing="1" w:after="100" w:afterAutospacing="1" w:line="240" w:lineRule="auto"/>
+        <w:rPr>
+          <w:rFonts w:ascii="Times New Roman" w:eastAsia="Times New Roman" w:hAnsi="Times New Roman" w:cs="Times New Roman"/>
+          <w:color w:val="auto"/>
+          <w:kern w:val="0"/>
+          <w:sz w:val="24"/>
+          <w:szCs w:val="24"/>
+          <w14:ligatures w14:val="none"/>
+        </w:rPr>
+      </w:pPr>
     </w:p>
     <w:p>
       <w:pPr>

</xml_diff>